<commit_message>
Reemplaza el backlog CSV por el archivo .reqw de ReqView
</commit_message>
<xml_diff>
--- a/U4A1-Trazabilidad/U4A1_Trazabilidad_Federico_Marquez.docx
+++ b/U4A1-Trazabilidad/U4A1_Trazabilidad_Federico_Marquez.docx
@@ -2308,7 +2308,7 @@
                 <w:b w:val="0"/>
                 <w:sz w:val="16"/>
               </w:rPr>
-              <w:t>Backlog de 18 ítems (HU-01 a HU-12, RNF-01 a RNF-06) en HTML y CSV de ReqView</w:t>
+              <w:t>Backlog de 18 ítems (HU-01 a HU-12, RNF-01 a RNF-06) en el archivo de ReqView (.reqw, fuente) y en HTML</w:t>
             </w:r>
           </w:p>
         </w:tc>
@@ -2960,7 +2960,7 @@
         <w:rPr>
           <w:b w:val="0"/>
         </w:rPr>
-        <w:t>Los datos de entrada son archivos del repositorio, no copias: el código del prototipo, el CSV del backlog, los resultados de las pruebas y tres JSON pequeños (necesidades, decisiones del CCB y catálogo). Si cambia una fuente, se vuelve a ejecutar el comando y todo se actualiza.</w:t>
+        <w:t>Los datos de entrada son archivos del repositorio, no copias: el código del prototipo, el archivo .reqw del backlog (ReqView), los resultados de las pruebas y tres JSON pequeños (necesidades, decisiones del CCB y catálogo). Si cambia una fuente, se vuelve a ejecutar el comando y todo se actualiza.</w:t>
       </w:r>
     </w:p>
     <w:p>

</xml_diff>